<commit_message>
Docx generation and download complete and australian share error removed
</commit_message>
<xml_diff>
--- a/public/assets/template.docx
+++ b/public/assets/template.docx
@@ -18,7 +18,7 @@
           <w:sz w:val="52"/>
         </w:rPr>
         <w:drawing>
-          <wp:inline distT="0" distB="0" distL="0" distR="0" wp14:anchorId="473DFF5C" wp14:editId="4DA499BD">
+          <wp:inline distT="0" distB="0" distL="0" distR="0" wp14:anchorId="473DFF5C" wp14:editId="3EE8DDC0">
             <wp:extent cx="1293412" cy="1266825"/>
             <wp:effectExtent l="0" t="0" r="2540" b="0"/>
             <wp:docPr id="34" name="Picture 34" descr="Logo&#10;&#10;Description automatically generated"/>
@@ -1361,29 +1361,73 @@
                 <w:b/>
                 <w:color w:val="0066CC"/>
               </w:rPr>
-              <w:t>Mark</w:t>
-            </w:r>
-          </w:p>
-        </w:tc>
-        <w:tc>
-          <w:tcPr>
-            <w:tcW w:w="3369" w:type="dxa"/>
-          </w:tcPr>
-          <w:p>
-            <w:pPr>
+              <w:t>{{</w:t>
+            </w:r>
+            <w:proofErr w:type="spellStart"/>
+            <w:r>
               <w:rPr>
                 <w:rFonts w:ascii="Segoe UI Light" w:hAnsi="Segoe UI Light" w:cs="Segoe UI Light"/>
                 <w:b/>
                 <w:color w:val="0066CC"/>
               </w:rPr>
-            </w:pPr>
+              <w:t>clientP</w:t>
+            </w:r>
+            <w:proofErr w:type="spellEnd"/>
             <w:r>
               <w:rPr>
                 <w:rFonts w:ascii="Segoe UI Light" w:hAnsi="Segoe UI Light" w:cs="Segoe UI Light"/>
                 <w:b/>
                 <w:color w:val="0066CC"/>
               </w:rPr>
-              <w:t>Maria</w:t>
+              <w:t>referred}}</w:t>
+            </w:r>
+          </w:p>
+        </w:tc>
+        <w:tc>
+          <w:tcPr>
+            <w:tcW w:w="3369" w:type="dxa"/>
+          </w:tcPr>
+          <w:p>
+            <w:pPr>
+              <w:rPr>
+                <w:rFonts w:ascii="Segoe UI Light" w:hAnsi="Segoe UI Light" w:cs="Segoe UI Light"/>
+                <w:b/>
+                <w:color w:val="0066CC"/>
+              </w:rPr>
+            </w:pPr>
+            <w:r>
+              <w:rPr>
+                <w:rFonts w:ascii="Segoe UI Light" w:hAnsi="Segoe UI Light" w:cs="Segoe UI Light"/>
+                <w:b/>
+                <w:color w:val="0066CC"/>
+              </w:rPr>
+              <w:t>{{</w:t>
+            </w:r>
+            <w:proofErr w:type="spellStart"/>
+            <w:r>
+              <w:rPr>
+                <w:rFonts w:ascii="Segoe UI Light" w:hAnsi="Segoe UI Light" w:cs="Segoe UI Light"/>
+                <w:b/>
+                <w:color w:val="0066CC"/>
+              </w:rPr>
+              <w:t>partner</w:t>
+            </w:r>
+            <w:r>
+              <w:rPr>
+                <w:rFonts w:ascii="Segoe UI Light" w:hAnsi="Segoe UI Light" w:cs="Segoe UI Light"/>
+                <w:b/>
+                <w:color w:val="0066CC"/>
+              </w:rPr>
+              <w:t>Preferred</w:t>
+            </w:r>
+            <w:proofErr w:type="spellEnd"/>
+            <w:r>
+              <w:rPr>
+                <w:rFonts w:ascii="Segoe UI Light" w:hAnsi="Segoe UI Light" w:cs="Segoe UI Light"/>
+                <w:b/>
+                <w:color w:val="0066CC"/>
+              </w:rPr>
+              <w:t>}}</w:t>
             </w:r>
           </w:p>
         </w:tc>
@@ -1464,26 +1508,14 @@
               <w:rPr>
                 <w:rFonts w:ascii="Segoe UI Light" w:hAnsi="Segoe UI Light" w:cs="Segoe UI Light"/>
               </w:rPr>
-              <w:t>{</w:t>
-            </w:r>
-            <w:r>
-              <w:rPr>
-                <w:rFonts w:ascii="Segoe UI Light" w:hAnsi="Segoe UI Light" w:cs="Segoe UI Light"/>
-              </w:rPr>
-              <w:t>{</w:t>
+              <w:t>{{</w:t>
             </w:r>
             <w:proofErr w:type="spellStart"/>
             <w:r>
               <w:rPr>
                 <w:rFonts w:ascii="Segoe UI Light" w:hAnsi="Segoe UI Light" w:cs="Segoe UI Light"/>
               </w:rPr>
-              <w:t>partner</w:t>
-            </w:r>
-            <w:r>
-              <w:rPr>
-                <w:rFonts w:ascii="Segoe UI Light" w:hAnsi="Segoe UI Light" w:cs="Segoe UI Light"/>
-              </w:rPr>
-              <w:t>T</w:t>
+              <w:t>partnerT</w:t>
             </w:r>
             <w:r>
               <w:rPr>
@@ -1497,13 +1529,7 @@
               <w:rPr>
                 <w:rFonts w:ascii="Segoe UI Light" w:hAnsi="Segoe UI Light" w:cs="Segoe UI Light"/>
               </w:rPr>
-              <w:t>}</w:t>
-            </w:r>
-            <w:r>
-              <w:rPr>
-                <w:rFonts w:ascii="Segoe UI Light" w:hAnsi="Segoe UI Light" w:cs="Segoe UI Light"/>
-              </w:rPr>
-              <w:t>}</w:t>
+              <w:t>}}</w:t>
             </w:r>
           </w:p>
         </w:tc>
@@ -3142,27 +3168,71 @@
                 <w:b/>
                 <w:color w:val="0066CC"/>
               </w:rPr>
-              <w:t>Mark</w:t>
-            </w:r>
-          </w:p>
-        </w:tc>
-        <w:tc>
-          <w:tcPr>
-            <w:tcW w:w="3404" w:type="dxa"/>
-          </w:tcPr>
-          <w:p>
-            <w:pPr>
-              <w:rPr>
-                <w:rFonts w:ascii="Segoe UI Light" w:hAnsi="Segoe UI Light" w:cs="Segoe UI Light"/>
-              </w:rPr>
-            </w:pPr>
+              <w:t>{{</w:t>
+            </w:r>
+            <w:proofErr w:type="spellStart"/>
             <w:r>
               <w:rPr>
                 <w:rFonts w:ascii="Segoe UI Light" w:hAnsi="Segoe UI Light" w:cs="Segoe UI Light"/>
                 <w:b/>
                 <w:color w:val="0066CC"/>
               </w:rPr>
-              <w:t>Maria</w:t>
+              <w:t>clientPreferred</w:t>
+            </w:r>
+            <w:proofErr w:type="spellEnd"/>
+            <w:r>
+              <w:rPr>
+                <w:rFonts w:ascii="Segoe UI Light" w:hAnsi="Segoe UI Light" w:cs="Segoe UI Light"/>
+                <w:b/>
+                <w:color w:val="0066CC"/>
+              </w:rPr>
+              <w:t>}}</w:t>
+            </w:r>
+          </w:p>
+        </w:tc>
+        <w:tc>
+          <w:tcPr>
+            <w:tcW w:w="3404" w:type="dxa"/>
+          </w:tcPr>
+          <w:p>
+            <w:pPr>
+              <w:rPr>
+                <w:rFonts w:ascii="Segoe UI Light" w:hAnsi="Segoe UI Light" w:cs="Segoe UI Light"/>
+              </w:rPr>
+            </w:pPr>
+            <w:r>
+              <w:rPr>
+                <w:rFonts w:ascii="Segoe UI Light" w:hAnsi="Segoe UI Light" w:cs="Segoe UI Light"/>
+                <w:b/>
+                <w:color w:val="0066CC"/>
+              </w:rPr>
+              <w:t>{{</w:t>
+            </w:r>
+            <w:proofErr w:type="spellStart"/>
+            <w:r>
+              <w:rPr>
+                <w:rFonts w:ascii="Segoe UI Light" w:hAnsi="Segoe UI Light" w:cs="Segoe UI Light"/>
+                <w:b/>
+                <w:color w:val="0066CC"/>
+              </w:rPr>
+              <w:t>partner</w:t>
+            </w:r>
+            <w:r>
+              <w:rPr>
+                <w:rFonts w:ascii="Segoe UI Light" w:hAnsi="Segoe UI Light" w:cs="Segoe UI Light"/>
+                <w:b/>
+                <w:color w:val="0066CC"/>
+              </w:rPr>
+              <w:t>Preferred</w:t>
+            </w:r>
+            <w:proofErr w:type="spellEnd"/>
+            <w:r>
+              <w:rPr>
+                <w:rFonts w:ascii="Segoe UI Light" w:hAnsi="Segoe UI Light" w:cs="Segoe UI Light"/>
+                <w:b/>
+                <w:color w:val="0066CC"/>
+              </w:rPr>
+              <w:t>}}</w:t>
             </w:r>
           </w:p>
         </w:tc>
@@ -3880,13 +3950,13 @@
         <w:tblLook w:val="04A0" w:firstRow="1" w:lastRow="0" w:firstColumn="1" w:lastColumn="0" w:noHBand="0" w:noVBand="1"/>
       </w:tblPr>
       <w:tblGrid>
-        <w:gridCol w:w="2028"/>
-        <w:gridCol w:w="1385"/>
-        <w:gridCol w:w="1002"/>
-        <w:gridCol w:w="986"/>
-        <w:gridCol w:w="1213"/>
-        <w:gridCol w:w="1526"/>
-        <w:gridCol w:w="2316"/>
+        <w:gridCol w:w="2170"/>
+        <w:gridCol w:w="1323"/>
+        <w:gridCol w:w="960"/>
+        <w:gridCol w:w="945"/>
+        <w:gridCol w:w="1160"/>
+        <w:gridCol w:w="1456"/>
+        <w:gridCol w:w="2442"/>
       </w:tblGrid>
       <w:tr>
         <w:trPr>
@@ -4052,7 +4122,13 @@
               <w:rPr>
                 <w:rFonts w:ascii="Segoe UI Light" w:hAnsi="Segoe UI Light" w:cs="Segoe UI Light"/>
               </w:rPr>
-              <w:t>{{#items</w:t>
+              <w:t>{{#</w:t>
+            </w:r>
+            <w:r>
+              <w:rPr>
+                <w:rFonts w:ascii="Segoe UI Light" w:hAnsi="Segoe UI Light" w:cs="Segoe UI Light"/>
+              </w:rPr>
+              <w:t>childitem</w:t>
             </w:r>
             <w:proofErr w:type="gramStart"/>
             <w:r>
@@ -4106,13 +4182,7 @@
               <w:rPr>
                 <w:rFonts w:ascii="Segoe UI Light" w:hAnsi="Segoe UI Light" w:cs="Segoe UI Light"/>
               </w:rPr>
-              <w:t>child</w:t>
-            </w:r>
-            <w:r>
-              <w:rPr>
-                <w:rFonts w:ascii="Segoe UI Light" w:hAnsi="Segoe UI Light" w:cs="Segoe UI Light"/>
-              </w:rPr>
-              <w:t>Last</w:t>
+              <w:t>childLast</w:t>
             </w:r>
             <w:proofErr w:type="spellEnd"/>
             <w:r>
@@ -4339,7 +4409,21 @@
               <w:rPr>
                 <w:rFonts w:ascii="Segoe UI Light" w:hAnsi="Segoe UI Light" w:cs="Segoe UI Light"/>
               </w:rPr>
-              <w:t>{/items}}</w:t>
+              <w:t>{/</w:t>
+            </w:r>
+            <w:proofErr w:type="spellStart"/>
+            <w:r>
+              <w:rPr>
+                <w:rFonts w:ascii="Segoe UI Light" w:hAnsi="Segoe UI Light" w:cs="Segoe UI Light"/>
+              </w:rPr>
+              <w:t>childitem</w:t>
+            </w:r>
+            <w:proofErr w:type="spellEnd"/>
+            <w:r>
+              <w:rPr>
+                <w:rFonts w:ascii="Segoe UI Light" w:hAnsi="Segoe UI Light" w:cs="Segoe UI Light"/>
+              </w:rPr>
+              <w:t>}}</w:t>
             </w:r>
           </w:p>
         </w:tc>
@@ -4393,19 +4477,19 @@
         </w:trPr>
         <w:tc>
           <w:tcPr>
-            <w:tcW w:w="4261" w:type="dxa"/>
-          </w:tcPr>
-          <w:p>
-            <w:pPr>
-              <w:rPr>
-                <w:rFonts w:ascii="Segoe UI Light" w:hAnsi="Segoe UI Light" w:cs="Segoe UI Light"/>
-              </w:rPr>
-            </w:pPr>
-          </w:p>
-        </w:tc>
-        <w:tc>
-          <w:tcPr>
-            <w:tcW w:w="3036" w:type="dxa"/>
+            <w:tcW w:w="2664" w:type="dxa"/>
+          </w:tcPr>
+          <w:p>
+            <w:pPr>
+              <w:rPr>
+                <w:rFonts w:ascii="Segoe UI Light" w:hAnsi="Segoe UI Light" w:cs="Segoe UI Light"/>
+              </w:rPr>
+            </w:pPr>
+          </w:p>
+        </w:tc>
+        <w:tc>
+          <w:tcPr>
+            <w:tcW w:w="3636" w:type="dxa"/>
           </w:tcPr>
           <w:p>
             <w:pPr>
@@ -4419,27 +4503,71 @@
                 <w:b/>
                 <w:color w:val="0066CC"/>
               </w:rPr>
-              <w:t>Mark</w:t>
-            </w:r>
-          </w:p>
-        </w:tc>
-        <w:tc>
-          <w:tcPr>
-            <w:tcW w:w="2811" w:type="dxa"/>
-          </w:tcPr>
-          <w:p>
-            <w:pPr>
-              <w:rPr>
-                <w:rFonts w:ascii="Segoe UI Light" w:hAnsi="Segoe UI Light" w:cs="Segoe UI Light"/>
-              </w:rPr>
-            </w:pPr>
+              <w:t>{{</w:t>
+            </w:r>
+            <w:proofErr w:type="spellStart"/>
             <w:r>
               <w:rPr>
                 <w:rFonts w:ascii="Segoe UI Light" w:hAnsi="Segoe UI Light" w:cs="Segoe UI Light"/>
                 <w:b/>
                 <w:color w:val="0066CC"/>
               </w:rPr>
-              <w:t>Maria</w:t>
+              <w:t>clientPreferred</w:t>
+            </w:r>
+            <w:proofErr w:type="spellEnd"/>
+            <w:r>
+              <w:rPr>
+                <w:rFonts w:ascii="Segoe UI Light" w:hAnsi="Segoe UI Light" w:cs="Segoe UI Light"/>
+                <w:b/>
+                <w:color w:val="0066CC"/>
+              </w:rPr>
+              <w:t>}}</w:t>
+            </w:r>
+          </w:p>
+        </w:tc>
+        <w:tc>
+          <w:tcPr>
+            <w:tcW w:w="3808" w:type="dxa"/>
+          </w:tcPr>
+          <w:p>
+            <w:pPr>
+              <w:rPr>
+                <w:rFonts w:ascii="Segoe UI Light" w:hAnsi="Segoe UI Light" w:cs="Segoe UI Light"/>
+              </w:rPr>
+            </w:pPr>
+            <w:r>
+              <w:rPr>
+                <w:rFonts w:ascii="Segoe UI Light" w:hAnsi="Segoe UI Light" w:cs="Segoe UI Light"/>
+                <w:b/>
+                <w:color w:val="0066CC"/>
+              </w:rPr>
+              <w:t>{{</w:t>
+            </w:r>
+            <w:proofErr w:type="spellStart"/>
+            <w:r>
+              <w:rPr>
+                <w:rFonts w:ascii="Segoe UI Light" w:hAnsi="Segoe UI Light" w:cs="Segoe UI Light"/>
+                <w:b/>
+                <w:color w:val="0066CC"/>
+              </w:rPr>
+              <w:t>partner</w:t>
+            </w:r>
+            <w:r>
+              <w:rPr>
+                <w:rFonts w:ascii="Segoe UI Light" w:hAnsi="Segoe UI Light" w:cs="Segoe UI Light"/>
+                <w:b/>
+                <w:color w:val="0066CC"/>
+              </w:rPr>
+              <w:t>Preferred</w:t>
+            </w:r>
+            <w:proofErr w:type="spellEnd"/>
+            <w:r>
+              <w:rPr>
+                <w:rFonts w:ascii="Segoe UI Light" w:hAnsi="Segoe UI Light" w:cs="Segoe UI Light"/>
+                <w:b/>
+                <w:color w:val="0066CC"/>
+              </w:rPr>
+              <w:t>}}</w:t>
             </w:r>
           </w:p>
         </w:tc>
@@ -4450,7 +4578,7 @@
         </w:trPr>
         <w:tc>
           <w:tcPr>
-            <w:tcW w:w="4261" w:type="dxa"/>
+            <w:tcW w:w="2664" w:type="dxa"/>
           </w:tcPr>
           <w:p>
             <w:pPr>
@@ -4470,7 +4598,7 @@
         </w:tc>
         <w:tc>
           <w:tcPr>
-            <w:tcW w:w="3036" w:type="dxa"/>
+            <w:tcW w:w="3636" w:type="dxa"/>
           </w:tcPr>
           <w:p>
             <w:pPr>
@@ -4502,7 +4630,7 @@
         </w:tc>
         <w:tc>
           <w:tcPr>
-            <w:tcW w:w="2811" w:type="dxa"/>
+            <w:tcW w:w="3808" w:type="dxa"/>
           </w:tcPr>
           <w:p>
             <w:pPr>
@@ -4545,7 +4673,7 @@
         </w:trPr>
         <w:tc>
           <w:tcPr>
-            <w:tcW w:w="4261" w:type="dxa"/>
+            <w:tcW w:w="2664" w:type="dxa"/>
           </w:tcPr>
           <w:p>
             <w:pPr>
@@ -4565,7 +4693,7 @@
         </w:tc>
         <w:tc>
           <w:tcPr>
-            <w:tcW w:w="3036" w:type="dxa"/>
+            <w:tcW w:w="3636" w:type="dxa"/>
           </w:tcPr>
           <w:p>
             <w:pPr>
@@ -4611,7 +4739,7 @@
         </w:tc>
         <w:tc>
           <w:tcPr>
-            <w:tcW w:w="2811" w:type="dxa"/>
+            <w:tcW w:w="3808" w:type="dxa"/>
           </w:tcPr>
           <w:p>
             <w:pPr>
@@ -4661,7 +4789,7 @@
         </w:trPr>
         <w:tc>
           <w:tcPr>
-            <w:tcW w:w="4261" w:type="dxa"/>
+            <w:tcW w:w="2664" w:type="dxa"/>
           </w:tcPr>
           <w:p>
             <w:pPr>
@@ -4681,7 +4809,7 @@
         </w:tc>
         <w:tc>
           <w:tcPr>
-            <w:tcW w:w="3036" w:type="dxa"/>
+            <w:tcW w:w="3636" w:type="dxa"/>
           </w:tcPr>
           <w:p>
             <w:pPr>
@@ -4725,7 +4853,7 @@
         </w:tc>
         <w:tc>
           <w:tcPr>
-            <w:tcW w:w="2811" w:type="dxa"/>
+            <w:tcW w:w="3808" w:type="dxa"/>
           </w:tcPr>
           <w:p>
             <w:pPr>
@@ -4774,7 +4902,7 @@
         </w:trPr>
         <w:tc>
           <w:tcPr>
-            <w:tcW w:w="4261" w:type="dxa"/>
+            <w:tcW w:w="2664" w:type="dxa"/>
           </w:tcPr>
           <w:p>
             <w:pPr>
@@ -4794,7 +4922,7 @@
         </w:tc>
         <w:tc>
           <w:tcPr>
-            <w:tcW w:w="3036" w:type="dxa"/>
+            <w:tcW w:w="3636" w:type="dxa"/>
           </w:tcPr>
           <w:p>
             <w:pPr>
@@ -4838,7 +4966,7 @@
         </w:tc>
         <w:tc>
           <w:tcPr>
-            <w:tcW w:w="2811" w:type="dxa"/>
+            <w:tcW w:w="3808" w:type="dxa"/>
           </w:tcPr>
           <w:p>
             <w:pPr>
@@ -4887,7 +5015,7 @@
         </w:trPr>
         <w:tc>
           <w:tcPr>
-            <w:tcW w:w="4261" w:type="dxa"/>
+            <w:tcW w:w="2664" w:type="dxa"/>
           </w:tcPr>
           <w:p>
             <w:pPr>
@@ -4907,7 +5035,7 @@
         </w:tc>
         <w:tc>
           <w:tcPr>
-            <w:tcW w:w="3036" w:type="dxa"/>
+            <w:tcW w:w="3636" w:type="dxa"/>
           </w:tcPr>
           <w:p>
             <w:pPr>
@@ -4953,7 +5081,7 @@
         </w:tc>
         <w:tc>
           <w:tcPr>
-            <w:tcW w:w="2811" w:type="dxa"/>
+            <w:tcW w:w="3808" w:type="dxa"/>
           </w:tcPr>
           <w:p>
             <w:pPr>
@@ -5003,7 +5131,7 @@
         </w:trPr>
         <w:tc>
           <w:tcPr>
-            <w:tcW w:w="4261" w:type="dxa"/>
+            <w:tcW w:w="2664" w:type="dxa"/>
           </w:tcPr>
           <w:p>
             <w:pPr>
@@ -5023,7 +5151,7 @@
         </w:tc>
         <w:tc>
           <w:tcPr>
-            <w:tcW w:w="3036" w:type="dxa"/>
+            <w:tcW w:w="3636" w:type="dxa"/>
           </w:tcPr>
           <w:p>
             <w:pPr>
@@ -5069,7 +5197,7 @@
         </w:tc>
         <w:tc>
           <w:tcPr>
-            <w:tcW w:w="2811" w:type="dxa"/>
+            <w:tcW w:w="3808" w:type="dxa"/>
           </w:tcPr>
           <w:p>
             <w:pPr>
@@ -5119,7 +5247,7 @@
         </w:trPr>
         <w:tc>
           <w:tcPr>
-            <w:tcW w:w="4261" w:type="dxa"/>
+            <w:tcW w:w="2664" w:type="dxa"/>
           </w:tcPr>
           <w:p>
             <w:pPr>
@@ -5139,7 +5267,7 @@
         </w:tc>
         <w:tc>
           <w:tcPr>
-            <w:tcW w:w="3036" w:type="dxa"/>
+            <w:tcW w:w="3636" w:type="dxa"/>
           </w:tcPr>
           <w:p>
             <w:pPr>
@@ -5171,7 +5299,7 @@
         </w:tc>
         <w:tc>
           <w:tcPr>
-            <w:tcW w:w="2811" w:type="dxa"/>
+            <w:tcW w:w="3808" w:type="dxa"/>
           </w:tcPr>
           <w:p>
             <w:pPr>
@@ -5207,7 +5335,7 @@
         </w:trPr>
         <w:tc>
           <w:tcPr>
-            <w:tcW w:w="4261" w:type="dxa"/>
+            <w:tcW w:w="2664" w:type="dxa"/>
           </w:tcPr>
           <w:p>
             <w:pPr>
@@ -5227,7 +5355,7 @@
         </w:tc>
         <w:tc>
           <w:tcPr>
-            <w:tcW w:w="3036" w:type="dxa"/>
+            <w:tcW w:w="3636" w:type="dxa"/>
           </w:tcPr>
           <w:p>
             <w:pPr>
@@ -5273,7 +5401,7 @@
         </w:tc>
         <w:tc>
           <w:tcPr>
-            <w:tcW w:w="2811" w:type="dxa"/>
+            <w:tcW w:w="3808" w:type="dxa"/>
           </w:tcPr>
           <w:p>
             <w:pPr>
@@ -5323,7 +5451,7 @@
         </w:trPr>
         <w:tc>
           <w:tcPr>
-            <w:tcW w:w="4261" w:type="dxa"/>
+            <w:tcW w:w="2664" w:type="dxa"/>
           </w:tcPr>
           <w:p>
             <w:pPr>
@@ -5343,7 +5471,7 @@
         </w:tc>
         <w:tc>
           <w:tcPr>
-            <w:tcW w:w="3036" w:type="dxa"/>
+            <w:tcW w:w="3636" w:type="dxa"/>
           </w:tcPr>
           <w:p>
             <w:pPr>
@@ -5389,7 +5517,7 @@
         </w:tc>
         <w:tc>
           <w:tcPr>
-            <w:tcW w:w="2811" w:type="dxa"/>
+            <w:tcW w:w="3808" w:type="dxa"/>
           </w:tcPr>
           <w:p>
             <w:pPr>
@@ -5440,7 +5568,7 @@
         </w:trPr>
         <w:tc>
           <w:tcPr>
-            <w:tcW w:w="4261" w:type="dxa"/>
+            <w:tcW w:w="2664" w:type="dxa"/>
           </w:tcPr>
           <w:p>
             <w:pPr>
@@ -5460,7 +5588,7 @@
         </w:tc>
         <w:tc>
           <w:tcPr>
-            <w:tcW w:w="3036" w:type="dxa"/>
+            <w:tcW w:w="3636" w:type="dxa"/>
           </w:tcPr>
           <w:p>
             <w:pPr>
@@ -5506,7 +5634,7 @@
         </w:tc>
         <w:tc>
           <w:tcPr>
-            <w:tcW w:w="2811" w:type="dxa"/>
+            <w:tcW w:w="3808" w:type="dxa"/>
           </w:tcPr>
           <w:p>
             <w:pPr>
@@ -5584,7 +5712,7 @@
         </w:trPr>
         <w:tc>
           <w:tcPr>
-            <w:tcW w:w="4261" w:type="dxa"/>
+            <w:tcW w:w="2664" w:type="dxa"/>
           </w:tcPr>
           <w:p>
             <w:pPr>
@@ -5604,7 +5732,7 @@
         </w:tc>
         <w:tc>
           <w:tcPr>
-            <w:tcW w:w="3036" w:type="dxa"/>
+            <w:tcW w:w="3636" w:type="dxa"/>
           </w:tcPr>
           <w:p>
             <w:pPr>
@@ -5650,7 +5778,7 @@
         </w:tc>
         <w:tc>
           <w:tcPr>
-            <w:tcW w:w="2811" w:type="dxa"/>
+            <w:tcW w:w="3808" w:type="dxa"/>
           </w:tcPr>
           <w:p>
             <w:pPr>
@@ -5700,7 +5828,7 @@
         </w:trPr>
         <w:tc>
           <w:tcPr>
-            <w:tcW w:w="4261" w:type="dxa"/>
+            <w:tcW w:w="2664" w:type="dxa"/>
           </w:tcPr>
           <w:p>
             <w:pPr>
@@ -5720,7 +5848,7 @@
         </w:tc>
         <w:tc>
           <w:tcPr>
-            <w:tcW w:w="3036" w:type="dxa"/>
+            <w:tcW w:w="3636" w:type="dxa"/>
           </w:tcPr>
           <w:p>
             <w:pPr>
@@ -5766,7 +5894,7 @@
         </w:tc>
         <w:tc>
           <w:tcPr>
-            <w:tcW w:w="2811" w:type="dxa"/>
+            <w:tcW w:w="3808" w:type="dxa"/>
           </w:tcPr>
           <w:p>
             <w:pPr>
@@ -5816,7 +5944,7 @@
         </w:trPr>
         <w:tc>
           <w:tcPr>
-            <w:tcW w:w="4261" w:type="dxa"/>
+            <w:tcW w:w="2664" w:type="dxa"/>
           </w:tcPr>
           <w:p>
             <w:pPr>
@@ -5836,7 +5964,7 @@
         </w:tc>
         <w:tc>
           <w:tcPr>
-            <w:tcW w:w="3036" w:type="dxa"/>
+            <w:tcW w:w="3636" w:type="dxa"/>
           </w:tcPr>
           <w:p>
             <w:pPr>
@@ -5882,7 +6010,7 @@
         </w:tc>
         <w:tc>
           <w:tcPr>
-            <w:tcW w:w="2811" w:type="dxa"/>
+            <w:tcW w:w="3808" w:type="dxa"/>
           </w:tcPr>
           <w:p>
             <w:pPr>
@@ -5932,7 +6060,7 @@
         </w:trPr>
         <w:tc>
           <w:tcPr>
-            <w:tcW w:w="4261" w:type="dxa"/>
+            <w:tcW w:w="2664" w:type="dxa"/>
           </w:tcPr>
           <w:p>
             <w:pPr>
@@ -5952,7 +6080,7 @@
         </w:tc>
         <w:tc>
           <w:tcPr>
-            <w:tcW w:w="3036" w:type="dxa"/>
+            <w:tcW w:w="3636" w:type="dxa"/>
           </w:tcPr>
           <w:p>
             <w:pPr>
@@ -5986,7 +6114,7 @@
         </w:tc>
         <w:tc>
           <w:tcPr>
-            <w:tcW w:w="2811" w:type="dxa"/>
+            <w:tcW w:w="3808" w:type="dxa"/>
           </w:tcPr>
           <w:p>
             <w:pPr>
@@ -6024,7 +6152,7 @@
         </w:trPr>
         <w:tc>
           <w:tcPr>
-            <w:tcW w:w="4261" w:type="dxa"/>
+            <w:tcW w:w="2664" w:type="dxa"/>
           </w:tcPr>
           <w:p>
             <w:pPr>
@@ -6044,7 +6172,7 @@
         </w:tc>
         <w:tc>
           <w:tcPr>
-            <w:tcW w:w="3036" w:type="dxa"/>
+            <w:tcW w:w="3636" w:type="dxa"/>
           </w:tcPr>
           <w:p>
             <w:pPr>
@@ -6090,7 +6218,7 @@
         </w:tc>
         <w:tc>
           <w:tcPr>
-            <w:tcW w:w="2811" w:type="dxa"/>
+            <w:tcW w:w="3808" w:type="dxa"/>
           </w:tcPr>
           <w:p>
             <w:pPr>
@@ -6168,7 +6296,7 @@
         </w:trPr>
         <w:tc>
           <w:tcPr>
-            <w:tcW w:w="4261" w:type="dxa"/>
+            <w:tcW w:w="2664" w:type="dxa"/>
           </w:tcPr>
           <w:p>
             <w:pPr>
@@ -6188,7 +6316,7 @@
         </w:tc>
         <w:tc>
           <w:tcPr>
-            <w:tcW w:w="3036" w:type="dxa"/>
+            <w:tcW w:w="3636" w:type="dxa"/>
           </w:tcPr>
           <w:p>
             <w:pPr>
@@ -6234,7 +6362,7 @@
         </w:tc>
         <w:tc>
           <w:tcPr>
-            <w:tcW w:w="2811" w:type="dxa"/>
+            <w:tcW w:w="3808" w:type="dxa"/>
           </w:tcPr>
           <w:p>
             <w:pPr>
@@ -6284,7 +6412,7 @@
         </w:trPr>
         <w:tc>
           <w:tcPr>
-            <w:tcW w:w="4261" w:type="dxa"/>
+            <w:tcW w:w="2664" w:type="dxa"/>
           </w:tcPr>
           <w:p>
             <w:pPr>
@@ -6304,7 +6432,7 @@
         </w:tc>
         <w:tc>
           <w:tcPr>
-            <w:tcW w:w="3036" w:type="dxa"/>
+            <w:tcW w:w="3636" w:type="dxa"/>
           </w:tcPr>
           <w:p>
             <w:pPr>
@@ -6350,7 +6478,7 @@
         </w:tc>
         <w:tc>
           <w:tcPr>
-            <w:tcW w:w="2811" w:type="dxa"/>
+            <w:tcW w:w="3808" w:type="dxa"/>
           </w:tcPr>
           <w:p>
             <w:pPr>
@@ -6401,7 +6529,7 @@
         </w:trPr>
         <w:tc>
           <w:tcPr>
-            <w:tcW w:w="4261" w:type="dxa"/>
+            <w:tcW w:w="2664" w:type="dxa"/>
           </w:tcPr>
           <w:p>
             <w:pPr>
@@ -6421,7 +6549,7 @@
         </w:tc>
         <w:tc>
           <w:tcPr>
-            <w:tcW w:w="3036" w:type="dxa"/>
+            <w:tcW w:w="3636" w:type="dxa"/>
           </w:tcPr>
           <w:p>
             <w:pPr>
@@ -6467,7 +6595,7 @@
         </w:tc>
         <w:tc>
           <w:tcPr>
-            <w:tcW w:w="2811" w:type="dxa"/>
+            <w:tcW w:w="3808" w:type="dxa"/>
           </w:tcPr>
           <w:p>
             <w:pPr>
@@ -6613,27 +6741,71 @@
                 <w:b/>
                 <w:color w:val="0066CC"/>
               </w:rPr>
-              <w:t>Mark</w:t>
-            </w:r>
-          </w:p>
-        </w:tc>
-        <w:tc>
-          <w:tcPr>
-            <w:tcW w:w="3433" w:type="dxa"/>
-          </w:tcPr>
-          <w:p>
-            <w:pPr>
-              <w:rPr>
-                <w:rFonts w:ascii="Segoe UI Light" w:hAnsi="Segoe UI Light" w:cs="Segoe UI Light"/>
-              </w:rPr>
-            </w:pPr>
+              <w:t>{{</w:t>
+            </w:r>
+            <w:proofErr w:type="spellStart"/>
             <w:r>
               <w:rPr>
                 <w:rFonts w:ascii="Segoe UI Light" w:hAnsi="Segoe UI Light" w:cs="Segoe UI Light"/>
                 <w:b/>
                 <w:color w:val="0066CC"/>
               </w:rPr>
-              <w:t>Maria</w:t>
+              <w:t>clientPreferred</w:t>
+            </w:r>
+            <w:proofErr w:type="spellEnd"/>
+            <w:r>
+              <w:rPr>
+                <w:rFonts w:ascii="Segoe UI Light" w:hAnsi="Segoe UI Light" w:cs="Segoe UI Light"/>
+                <w:b/>
+                <w:color w:val="0066CC"/>
+              </w:rPr>
+              <w:t>}}</w:t>
+            </w:r>
+          </w:p>
+        </w:tc>
+        <w:tc>
+          <w:tcPr>
+            <w:tcW w:w="3433" w:type="dxa"/>
+          </w:tcPr>
+          <w:p>
+            <w:pPr>
+              <w:rPr>
+                <w:rFonts w:ascii="Segoe UI Light" w:hAnsi="Segoe UI Light" w:cs="Segoe UI Light"/>
+              </w:rPr>
+            </w:pPr>
+            <w:r>
+              <w:rPr>
+                <w:rFonts w:ascii="Segoe UI Light" w:hAnsi="Segoe UI Light" w:cs="Segoe UI Light"/>
+                <w:b/>
+                <w:color w:val="0066CC"/>
+              </w:rPr>
+              <w:t>{{</w:t>
+            </w:r>
+            <w:proofErr w:type="spellStart"/>
+            <w:r>
+              <w:rPr>
+                <w:rFonts w:ascii="Segoe UI Light" w:hAnsi="Segoe UI Light" w:cs="Segoe UI Light"/>
+                <w:b/>
+                <w:color w:val="0066CC"/>
+              </w:rPr>
+              <w:t>partner</w:t>
+            </w:r>
+            <w:r>
+              <w:rPr>
+                <w:rFonts w:ascii="Segoe UI Light" w:hAnsi="Segoe UI Light" w:cs="Segoe UI Light"/>
+                <w:b/>
+                <w:color w:val="0066CC"/>
+              </w:rPr>
+              <w:t>Preferred</w:t>
+            </w:r>
+            <w:proofErr w:type="spellEnd"/>
+            <w:r>
+              <w:rPr>
+                <w:rFonts w:ascii="Segoe UI Light" w:hAnsi="Segoe UI Light" w:cs="Segoe UI Light"/>
+                <w:b/>
+                <w:color w:val="0066CC"/>
+              </w:rPr>
+              <w:t>}}</w:t>
             </w:r>
           </w:p>
         </w:tc>
@@ -7533,13 +7705,7 @@
               <w:rPr>
                 <w:rFonts w:ascii="Segoe UI Light" w:hAnsi="Segoe UI Light" w:cs="Segoe UI Light"/>
               </w:rPr>
-              <w:t>Frequency</w:t>
-            </w:r>
-            <w:r>
-              <w:rPr>
-                <w:rFonts w:ascii="Segoe UI Light" w:hAnsi="Segoe UI Light" w:cs="Segoe UI Light"/>
-              </w:rPr>
-              <w:t>1}}</w:t>
+              <w:t>Frequency1}}</w:t>
             </w:r>
           </w:p>
         </w:tc>
@@ -7581,13 +7747,7 @@
               <w:rPr>
                 <w:rFonts w:ascii="Segoe UI Light" w:hAnsi="Segoe UI Light" w:cs="Segoe UI Light"/>
               </w:rPr>
-              <w:t>Total</w:t>
-            </w:r>
-            <w:r>
-              <w:rPr>
-                <w:rFonts w:ascii="Segoe UI Light" w:hAnsi="Segoe UI Light" w:cs="Segoe UI Light"/>
-              </w:rPr>
-              <w:t>1}}</w:t>
+              <w:t>Total1}}</w:t>
             </w:r>
           </w:p>
         </w:tc>
@@ -11260,7 +11420,7 @@
           <w:rFonts w:ascii="Segoe UI Light" w:hAnsi="Segoe UI Light" w:cs="Segoe UI Light"/>
         </w:rPr>
         <w:pict w14:anchorId="169E49CE">
-          <v:shape id="_x0000_i1027" type="#_x0000_t75" style="width:6.6pt;height:10.8pt;visibility:visible;mso-wrap-style:square" filled="t">
+          <v:shape id="_x0000_i1027" type="#_x0000_t75" style="width:6.75pt;height:10.5pt;visibility:visible;mso-wrap-style:square" filled="t">
             <v:imagedata r:id="rId15" o:title=""/>
           </v:shape>
         </w:pict>
@@ -11771,7 +11931,7 @@
           <w:rFonts w:ascii="Segoe UI Light" w:hAnsi="Segoe UI Light" w:cs="Segoe UI Light"/>
         </w:rPr>
         <w:pict w14:anchorId="2EBC52B5">
-          <v:shape id="_x0000_i1028" type="#_x0000_t75" style="width:6.6pt;height:10.8pt;visibility:visible;mso-wrap-style:square" filled="t">
+          <v:shape id="_x0000_i1028" type="#_x0000_t75" style="width:6.75pt;height:10.5pt;visibility:visible;mso-wrap-style:square" filled="t">
             <v:imagedata r:id="rId15" o:title=""/>
           </v:shape>
         </w:pict>
@@ -15339,14 +15499,14 @@
         <v:path o:extrusionok="f" gradientshapeok="t" o:connecttype="rect"/>
         <o:lock v:ext="edit" aspectratio="t"/>
       </v:shapetype>
-      <v:shape id="Picture 1538407619" o:spid="_x0000_i1025" type="#_x0000_t75" style="width:6pt;height:7.8pt;visibility:visible;mso-wrap-style:square" o:bullet="t" filled="t">
+      <v:shape id="Picture 1538407619" o:spid="_x0000_i1025" type="#_x0000_t75" style="width:6pt;height:7.5pt;visibility:visible;mso-wrap-style:square" o:bullet="t" filled="t">
         <v:imagedata r:id="rId1" o:title=""/>
       </v:shape>
     </w:pict>
   </w:numPicBullet>
   <w:numPicBullet w:numPicBulletId="1">
     <w:pict>
-      <v:shape id="Picture 1936811898" o:spid="_x0000_i1026" type="#_x0000_t75" style="width:6.6pt;height:9pt;visibility:visible;mso-wrap-style:square" o:bullet="t" filled="t">
+      <v:shape id="Picture 1936811898" o:spid="_x0000_i1026" type="#_x0000_t75" style="width:6.75pt;height:9pt;visibility:visible;mso-wrap-style:square" o:bullet="t" filled="t">
         <v:imagedata r:id="rId2" o:title=""/>
       </v:shape>
     </w:pict>
@@ -16849,6 +17009,7 @@
   <w:style w:type="character" w:default="1" w:styleId="DefaultParagraphFont">
     <w:name w:val="Default Paragraph Font"/>
     <w:uiPriority w:val="1"/>
+    <w:semiHidden/>
     <w:unhideWhenUsed/>
   </w:style>
   <w:style w:type="table" w:default="1" w:styleId="TableNormal">

</xml_diff>